<commit_message>
PerTenantExtensionCop MemoPad Attached to prev. line conflict with E-DocImport
</commit_message>
<xml_diff>
--- a/ReportLayouts/wanPurchaseBlanketOrder.docx
+++ b/ReportLayouts/wanPurchaseBlanketOrder.docx
@@ -5871,6 +5871,591 @@
  < / N a v W o r d R e p o r t X m l P a r t > 
 </file>
 
+<file path=customXml/item3.xml>��< ? x m l   v e r s i o n = " 1 . 0 "   e n c o d i n g = " u t f - 1 6 " ? > + 
+ < N a v W o r d R e p o r t X m l P a r t   x m l n s = " u r n : m i c r o s o f t - d y n a m i c s - b u s i n e s s c e n t r a l / i n t e r n a l / e x t e n d e d / r e p o r t s / w a n _ P u r c h a s e _ B l a n k e t _ O r d e r / 8 7 3 1 0 / " > + 
+     < T o o l t i p s > + 
+         < T o o l t i p   c o l u m n = " N o _ P u r c h H e a d e r "   E l e m e n t I d = " 5 2 0 3 3 9 3 5 2 " > + 
+             < T o o l t i p T e x t   l a n g = " e n - U S " > S p e c i f i e s   a   u n i q u e   n u m b e r   t h a t   i d e n t i f i e s   t h e   p u r c h a s e   o r d e r .   T h e   n u m b e r   c a n   b e   g e n e r a t e d   a u t o m a t i c a l l y   f r o m   a   n u m b e r   s e r i e s ,   o r   y o u   c a n   n u m b e r   e a c h   o f   t h e m   m a n u a l l y . < / T o o l t i p T e x t > + 
+         < / T o o l t i p > + 
+         < T o o l t i p   c o l u m n = " Y o u r R e f _ P u r c h H e a d e r "   E l e m e n t I d = " 1 9 8 5 3 6 8 6 3 1 " > + 
+             < T o o l t i p T e x t   l a n g = " e n - U S " > S p e c i f i e s   t h e   v e n d o r ' s   r e f e r e n c e . < / T o o l t i p T e x t > + 
+         < / T o o l t i p > + 
+         < T o o l t i p   c o l u m n = " B u y F r m V e n d N o _ P u r c h H e a d e r "   E l e m e n t I d = " 1 1 4 1 1 5 6 0 2 " > + 
+             < T o o l t i p T e x t   l a n g = " e n - U S " > S p e c i f i e s   t h e   v e n d o r   w h o   w i l l   d e l i v e r   t h e   g o o d s   o r   s e r v i c e s .   E a c h   v e n d o r   h a s   a   u n i q u e   n u m b e r   t o   h e l p   y o u   t r a c k   r e l a t e d   d o c u m e n t s .   T h e   n u m b e r   c a n   c o m e   f r o m   a   n u m b e r   s e r i e s   o r   b e   a d d e d   m a n u a l l y . < / T o o l t i p T e x t > + 
+         < / T o o l t i p > + 
+         < T o o l t i p   c o l u m n = " P a y T o V e n d N o _ P u r c h H e a d e r "   E l e m e n t I d = " 6 3 5 5 6 4 4 9 8 " > + 
+             < T o o l t i p T e x t   l a n g = " e n - U S " > S p e c i f i e s   t h e   n u m b e r   o f   t h e   v e n d o r   t h a t   y o u   r e c e i v e d   t h e   i n v o i c e   f r o m . < / T o o l t i p T e x t > + 
+         < / T o o l t i p > + 
+         < T o o l t i p   c o l u m n = " L i n e N o _ P u r c h L i n e "   E l e m e n t I d = " 1 7 4 8 8 4 8 6 5 " > + 
+             < T o o l t i p T e x t   l a n g = " e n - U S " > S p e c i f i e s   t h e   l i n e ' s   n u m b e r . < / T o o l t i p T e x t > + 
+         < / T o o l t i p > + 
+         < T o o l t i p   c o l u m n = " I t e m N o _ P u r c h L i n e "   E l e m e n t I d = " 1 0 5 7 2 2 4 1 4 0 " > + 
+             < T o o l t i p T e x t   l a n g = " e n - U S " > S p e c i f i e s   t h e   n u m b e r   o f   t h e   i n v o l v e d   e n t r y   o r   r e c o r d ,   a c c o r d i n g   t o   t h e   s p e c i f i e d   n u m b e r   s e r i e s . < / T o o l t i p T e x t > + 
+         < / T o o l t i p > + 
+         < T o o l t i p   c o l u m n = " D e s c _ P u r c h L i n e "   E l e m e n t I d = " 1 1 6 1 7 0 2 0 8 9 " > + 
+             < T o o l t i p T e x t   l a n g = " e n - U S " > S p e c i f i e s   a   d e s c r i p t i o n   o f   t h e   e n t r y   o f   t h e   p r o d u c t   t o   b e   p u r c h a s e d .   T o   a d d   a   n o n - t r a n s a c t i o n a l   t e x t   l i n e ,   f i l l   i n   t h e   D e s c r i p t i o n   f i e l d   o n l y . < / T o o l t i p T e x t > + 
+         < / T o o l t i p > + 
+         < T o o l t i p   c o l u m n = " U n i t P r i c e _ P u r c h L i n e "   E l e m e n t I d = " 2 0 6 3 2 5 9 8 1 9 " > + 
+             < T o o l t i p T e x t   l a n g = " e n - U S " > S p e c i f i e s   t h e   p r i c e ,   i n   L C Y ,   o f   o n e   u n i t   o f   t h e   i t e m   o r   r e s o u r c e .   Y o u   c a n   e n t e r   a   p r i c e   m a n u a l l y   o r   h a v e   i t   e n t e r e d   a c c o r d i n g   t o   t h e   P r i c e / P r o f i t   C a l c u l a t i o n   f i e l d   o n   t h e   r e l a t e d   c a r d . < / T o o l t i p T e x t > + 
+         < / T o o l t i p > + 
+         < T o o l t i p   c o l u m n = " J o b N o _ P u r c h L i n e "   E l e m e n t I d = " 2 7 7 7 0 3 3 2 6 " > + 
+             < T o o l t i p T e x t   l a n g = " e n - U S " > S p e c i f i e s   t h e   n u m b e r   o f   t h e   r e l a t e d   p r o j e c t .   I f   y o u   f i l l   i n   t h i s   f i e l d   a n d   t h e   P r o j e c t   T a s k   N o .   f i e l d ,   t h e n   a   p r o j e c t   l e d g e r   e n t r y   w i l l   b e   p o s t e d   t o g e t h e r   w i t h   t h e   p u r c h a s e   l i n e . < / T o o l t i p T e x t > + 
+         < / T o o l t i p > + 
+         < T o o l t i p   c o l u m n = " J o b T a s k N o _ P u r c h L i n e "   E l e m e n t I d = " 7 2 6 6 6 9 0 1 1 " > + 
+             < T o o l t i p T e x t   l a n g = " e n - U S " > S p e c i f i e s   t h e   n u m b e r   o f   t h e   r e l a t e d   p r o j e c t   t a s k . < / T o o l t i p T e x t > + 
+         < / T o o l t i p > + 
+     < / T o o l t i p s > + 
+     < P u r c h a s e _ H e a d e r   E l e m e n t T y p e = " D a t a I t e m "   E l e m e n t I d = " 3 0 1 5 4 4 2 5 8 " > + 
+         < A l l o w I n v o i c e D i s c _ L b l   E l e m e n t T y p e = " C o l u m n "   E l e m e n t I d = " 1 4 4 9 1 1 7 7 6 3 "   D a t a T y p e = " L a b e l " > A l l o w I n v o i c e D i s c _ L b l < / A l l o w I n v o i c e D i s c _ L b l > + 
+         < A m o u n t _ L b l   E l e m e n t T y p e = " C o l u m n "   E l e m e n t I d = " 1 8 5 7 4 6 5 8 6 0 "   D a t a T y p e = " L a b e l " > A m o u n t _ L b l < / A m o u n t _ L b l > + 
+         < B u y e r _ L b l   E l e m e n t T y p e = " C o l u m n "   E l e m e n t I d = " 1 7 4 6 3 3 5 4 8 9 "   D a t a T y p e = " L a b e l " > B u y e r _ L b l < / B u y e r _ L b l > + 
+         < B u y F r m V e n d N o _ P u r c h H e a d e r   E l e m e n t T y p e = " C o l u m n "   E l e m e n t I d = " 1 1 4 1 1 5 6 0 2 "   D a t a T y p e = " C o d e " > B u y F r m V e n d N o _ P u r c h H e a d e r < / B u y F r m V e n d N o _ P u r c h H e a d e r > + 
+         < B u y F r m V e n d N o _ P u r c h H e a d e r _ L b l   E l e m e n t T y p e = " C o l u m n "   E l e m e n t I d = " 1 8 5 3 8 7 0 8 5 "   D a t a T y p e = " S t r i n g " > B u y F r m V e n d N o _ P u r c h H e a d e r _ L b l < / B u y F r m V e n d N o _ P u r c h H e a d e r _ L b l > + 
+         < B u y F r o m A d d r 1   E l e m e n t T y p e = " C o l u m n "   E l e m e n t I d = " 9 9 4 5 5 4 4 3 3 "   D a t a T y p e = " T e x t " > B u y F r o m A d d r 1 < / B u y F r o m A d d r 1 > + 
+         < B u y F r o m A d d r 2   E l e m e n t T y p e = " C o l u m n "   E l e m e n t I d = " 1 3 8 7 3 2 3 0 1 2 "   D a t a T y p e = " T e x t " > B u y F r o m A d d r 2 < / B u y F r o m A d d r 2 > + 
+         < B u y F r o m A d d r 3   E l e m e n t T y p e = " C o l u m n "   E l e m e n t I d = " 2 0 2 5 0 1 9 6 2 9 "   D a t a T y p e = " T e x t " > B u y F r o m A d d r 3 < / B u y F r o m A d d r 3 > + 
+         < B u y F r o m A d d r 4   E l e m e n t T y p e = " C o l u m n "   E l e m e n t I d = " 1 1 1 9 2 9 7 7 8 "   D a t a T y p e = " T e x t " > B u y F r o m A d d r 4 < / B u y F r o m A d d r 4 > + 
+         < B u y F r o m A d d r 5   E l e m e n t T y p e = " C o l u m n "   E l e m e n t I d = " 7 4 9 6 2 6 3 9 5 "   D a t a T y p e = " T e x t " > B u y F r o m A d d r 5 < / B u y F r o m A d d r 5 > + 
+         < B u y F r o m A d d r 6   E l e m e n t T y p e = " C o l u m n "   E l e m e n t I d = " 1 1 6 3 4 6 3 4 5 6 "   D a t a T y p e = " T e x t " > B u y F r o m A d d r 6 < / B u y F r o m A d d r 6 > + 
+         < B u y F r o m A d d r 7   E l e m e n t T y p e = " C o l u m n "   E l e m e n t I d = " 5 2 5 7 6 6 8 3 9 "   D a t a T y p e = " T e x t " > B u y F r o m A d d r 7 < / B u y F r o m A d d r 7 > + 
+         < B u y F r o m A d d r 8   E l e m e n t T y p e = " C o l u m n "   E l e m e n t I d = " 8 2 5 6 4 5 4 1 0 "   D a t a T y p e = " T e x t " > B u y F r o m A d d r 8 < / B u y F r o m A d d r 8 > + 
+         < B u y F r o m C o n t a c t E m a i l   E l e m e n t T y p e = " C o l u m n "   E l e m e n t I d = " 1 4 6 0 8 4 1 4 4 9 "   D a t a T y p e = " T e x t " > B u y F r o m C o n t a c t E m a i l < / B u y F r o m C o n t a c t E m a i l > + 
+         < B u y F r o m C o n t a c t E m a i l L b l   E l e m e n t T y p e = " C o l u m n "   E l e m e n t I d = " 4 6 2 0 6 3 8 7 5 "   D a t a T y p e = " L a b e l " > B u y F r o m C o n t a c t E m a i l L b l < / B u y F r o m C o n t a c t E m a i l L b l > + 
+         < B u y F r o m C o n t a c t M o b i l e P h o n e N o   E l e m e n t T y p e = " C o l u m n "   E l e m e n t I d = " 6 8 2 3 8 6 3 9 2 "   D a t a T y p e = " T e x t " > B u y F r o m C o n t a c t M o b i l e P h o n e N o < / B u y F r o m C o n t a c t M o b i l e P h o n e N o > + 
+         < B u y F r o m C o n t a c t M o b i l e P h o n e N o L b l   E l e m e n t T y p e = " C o l u m n "   E l e m e n t I d = " 3 5 0 1 9 3 3 8 "   D a t a T y p e = " L a b e l " > B u y F r o m C o n t a c t M o b i l e P h o n e N o L b l < / B u y F r o m C o n t a c t M o b i l e P h o n e N o L b l > + 
+         < B u y F r o m C o n t a c t P h o n e N o   E l e m e n t T y p e = " C o l u m n "   E l e m e n t I d = " 1 6 2 4 1 1 6 4 9 6 "   D a t a T y p e = " T e x t " > B u y F r o m C o n t a c t P h o n e N o < / B u y F r o m C o n t a c t P h o n e N o > + 
+         < B u y F r o m C o n t a c t P h o n e N o L b l   E l e m e n t T y p e = " C o l u m n "   E l e m e n t I d = " 3 6 1 4 5 0 8 0 2 "   D a t a T y p e = " L a b e l " > B u y F r o m C o n t a c t P h o n e N o L b l < / B u y F r o m C o n t a c t P h o n e N o L b l > + 
+         < C o m p a n y A d d r e s s 1   E l e m e n t T y p e = " C o l u m n "   E l e m e n t I d = " 1 8 8 4 1 6 4 3 2 3 "   D a t a T y p e = " T e x t " > C o m p a n y A d d r e s s 1 < / C o m p a n y A d d r e s s 1 > + 
+         < C o m p a n y A d d r e s s 2   E l e m e n t T y p e = " C o l u m n "   E l e m e n t I d = " 1 2 4 6 4 6 7 7 0 6 "   D a t a T y p e = " T e x t " > C o m p a n y A d d r e s s 2 < / C o m p a n y A d d r e s s 2 > + 
+         < C o m p a n y A d d r e s s 3   E l e m e n t T y p e = " C o l u m n "   E l e m e n t I d = " 6 0 8 7 7 1 0 8 9 "   D a t a T y p e = " T e x t " > C o m p a n y A d d r e s s 3 < / C o m p a n y A d d r e s s 3 > + 
+         < C o m p a n y A d d r e s s 4   E l e m e n t T y p e = " C o l u m n "   E l e m e n t I d = " 7 7 7 6 8 0 1 1 2 "   D a t a T y p e = " T e x t " > C o m p a n y A d d r e s s 4 < / C o m p a n y A d d r e s s 4 > + 
+         < C o m p a n y A d d r e s s 5   E l e m e n t T y p e = " C o l u m n "   E l e m e n t I d = " 1 3 9 9 8 3 4 9 5 "   D a t a T y p e = " T e x t " > C o m p a n y A d d r e s s 5 < / C o m p a n y A d d r e s s 5 > + 
+         < C o m p a n y A d d r e s s 6   E l e m e n t T y p e = " C o l u m n "   E l e m e n t I d = " 4 9 7 7 1 3 1 2 2 "   D a t a T y p e = " T e x t " > C o m p a n y A d d r e s s 6 < / C o m p a n y A d d r e s s 6 > + 
+         < C o m p a n y B a n k A c c o u n t N o   E l e m e n t T y p e = " C o l u m n "   E l e m e n t I d = " 3 0 1 4 0 2 0 4 "   D a t a T y p e = " T e x t " > C o m p a n y B a n k A c c o u n t N o < / C o m p a n y B a n k A c c o u n t N o > + 
+         < C o m p a n y B a n k A c c o u n t N o _ L b l   E l e m e n t T y p e = " C o l u m n "   E l e m e n t I d = " 1 0 9 7 7 4 3 3 4 5 "   D a t a T y p e = " L a b e l " > C o m p a n y B a n k A c c o u n t N o _ L b l < / C o m p a n y B a n k A c c o u n t N o _ L b l > + 
+         < C o m p a n y B a n k B r a n c h N o   E l e m e n t T y p e = " C o l u m n "   E l e m e n t I d = " 7 9 3 1 3 3 0 5 7 "   D a t a T y p e = " T e x t " > C o m p a n y B a n k B r a n c h N o < / C o m p a n y B a n k B r a n c h N o > + 
+         < C o m p a n y B a n k B r a n c h N o _ L b l   E l e m e n t T y p e = " C o l u m n "   E l e m e n t I d = " 3 2 7 9 0 6 6 9 2 "   D a t a T y p e = " S t r i n g " > C o m p a n y B a n k B r a n c h N o _ L b l < / C o m p a n y B a n k B r a n c h N o _ L b l > + 
+         < C o m p a n y B a n k N a m e   E l e m e n t T y p e = " C o l u m n "   E l e m e n t I d = " 1 5 3 4 9 0 5 6 0 5 "   D a t a T y p e = " T e x t " > C o m p a n y B a n k N a m e < / C o m p a n y B a n k N a m e > + 
+         < C o m p a n y B a n k N a m e _ L b l   E l e m e n t T y p e = " C o l u m n "   E l e m e n t I d = " 1 2 0 4 3 0 7 0 1 4 "   D a t a T y p e = " L a b e l " > C o m p a n y B a n k N a m e _ L b l < / C o m p a n y B a n k N a m e _ L b l > + 
+         < C o m p a n y E M a i l   E l e m e n t T y p e = " C o l u m n "   E l e m e n t I d = " 1 6 7 7 0 7 4 0 5 8 "   D a t a T y p e = " T e x t " > C o m p a n y E M a i l < / C o m p a n y E M a i l > + 
+         < C o m p a n y E m a i l _ L b l   E l e m e n t T y p e = " C o l u m n "   E l e m e n t I d = " 8 0 8 1 5 9 1 7 9 "   D a t a T y p e = " L a b e l " > C o m p a n y E m a i l _ L b l < / C o m p a n y E m a i l _ L b l > + 
+         < C o m p a n y G i r o N o   E l e m e n t T y p e = " C o l u m n "   E l e m e n t I d = " 1 3 6 0 1 9 6 3 2 0 "   D a t a T y p e = " T e x t " > C o m p a n y G i r o N o < / C o m p a n y G i r o N o > + 
+         < C o m p a n y G i r o N o _ L b l   E l e m e n t T y p e = " C o l u m n "   E l e m e n t I d = " 8 6 1 6 0 2 1 1 5 "   D a t a T y p e = " L a b e l " > C o m p a n y G i r o N o _ L b l < / C o m p a n y G i r o N o _ L b l > + 
+         < C o m p a n y H o m e P a g e   E l e m e n t T y p e = " C o l u m n "   E l e m e n t I d = " 1 9 8 9 1 8 8 7 0 "   D a t a T y p e = " T e x t " > C o m p a n y H o m e P a g e < / C o m p a n y H o m e P a g e > + 
+         < C o m p a n y H o m e P a g e _ L b l   E l e m e n t T y p e = " C o l u m n "   E l e m e n t I d = " 1 5 2 9 3 4 8 1 7 1 "   D a t a T y p e = " L a b e l " > C o m p a n y H o m e P a g e _ L b l < / C o m p a n y H o m e P a g e _ L b l > + 
+         < C o m p a n y I B A N   E l e m e n t T y p e = " C o l u m n "   E l e m e n t I d = " 9 0 6 5 4 9 1 8 2 "   D a t a T y p e = " C o d e " > C o m p a n y I B A N < / C o m p a n y I B A N > + 
+         < C o m p a n y I B A N _ L b l   E l e m e n t T y p e = " C o l u m n "   E l e m e n t I d = " 1 2 6 7 9 5 2 2 2 7 "   D a t a T y p e = " S t r i n g " > C o m p a n y I B A N _ L b l < / C o m p a n y I B A N _ L b l > + 
+         < C o m p a n y L o g o P o s i t i o n   E l e m e n t T y p e = " C o l u m n "   E l e m e n t I d = " 1 4 2 5 2 6 6 6 8 8 "   D a t a T y p e = " I n t e g e r " > C o m p a n y L o g o P o s i t i o n < / C o m p a n y L o g o P o s i t i o n > + 
+         < C o m p a n y P h o n e N o   E l e m e n t T y p e = " C o l u m n "   E l e m e n t I d = " 2 5 0 4 4 0 6 5 5 "   D a t a T y p e = " T e x t " > C o m p a n y P h o n e N o < / C o m p a n y P h o n e N o > + 
+         < C o m p a n y P h o n e N o _ L b l   E l e m e n t T y p e = " C o l u m n "   E l e m e n t I d = " 5 5 8 5 9 3 5 8 6 "   D a t a T y p e = " L a b e l " > C o m p a n y P h o n e N o _ L b l < / C o m p a n y P h o n e N o _ L b l > + 
+         < C o m p a n y P i c t u r e   E l e m e n t T y p e = " C o l u m n "   E l e m e n t I d = " 1 3 9 7 4 1 1 0 7 4 "   D a t a T y p e = " B l o b "   / > + 
+         < C o m p a n y R e g i s t r a t i o n N u m b e r   E l e m e n t T y p e = " C o l u m n "   E l e m e n t I d = " 2 0 2 3 6 3 9 4 2 4 "   D a t a T y p e = " T e x t " > C o m p a n y R e g i s t r a t i o n N u m b e r < / C o m p a n y R e g i s t r a t i o n N u m b e r > + 
+         < C o m p a n y R e g i s t r a t i o n N u m b e r _ L b l   E l e m e n t T y p e = " C o l u m n "   E l e m e n t I d = " 1 8 3 3 1 0 6 6 5 3 "   D a t a T y p e = " T e x t " > C o m p a n y R e g i s t r a t i o n N u m b e r _ L b l < / C o m p a n y R e g i s t r a t i o n N u m b e r _ L b l > + 
+         < C o m p a n y S W I F T   E l e m e n t T y p e = " C o l u m n "   E l e m e n t I d = " 6 6 8 2 5 0 2 4 5 "   D a t a T y p e = " C o d e " > C o m p a n y S W I F T < / C o m p a n y S W I F T > + 
+         < C o m p a n y S W I F T _ L b l   E l e m e n t T y p e = " C o l u m n "   E l e m e n t I d = " 2 0 2 9 5 9 7 3 8 4 "   D a t a T y p e = " S t r i n g " > C o m p a n y S W I F T _ L b l < / C o m p a n y S W I F T _ L b l > + 
+         < C o m p a n y V A T R e g i s t r a t i o n N o   E l e m e n t T y p e = " C o l u m n "   E l e m e n t I d = " 1 9 1 4 0 1 3 6 4 9 "   D a t a T y p e = " T e x t " > C o m p a n y V A T R e g i s t r a t i o n N o < / C o m p a n y V A T R e g i s t r a t i o n N o > + 
+         < C o m p a n y V A T R e g i s t r a t i o n N o _ L b l   E l e m e n t T y p e = " C o l u m n "   E l e m e n t I d = " 9 2 4 5 0 3 1 2 4 "   D a t a T y p e = " T e x t " > C o m p a n y V A T R e g i s t r a t i o n N o _ L b l < / C o m p a n y V A T R e g i s t r a t i o n N o _ L b l > + 
+         < C o m p a n y V A T R e g N o   E l e m e n t T y p e = " C o l u m n "   E l e m e n t I d = " 1 7 1 4 3 1 9 3 6 "   D a t a T y p e = " T e x t " > C o m p a n y V A T R e g N o < / C o m p a n y V A T R e g N o > + 
+         < C o m p a n y V A T R e g N o _ L b l   E l e m e n t T y p e = " C o l u m n "   E l e m e n t I d = " 7 7 3 2 0 1 5 0 1 "   D a t a T y p e = " T e x t " > C o m p a n y V A T R e g N o _ L b l < / C o m p a n y V A T R e g N o _ L b l > + 
+         < C o n f i r m T o C a p t i o n _ L b l   E l e m e n t T y p e = " C o l u m n "   E l e m e n t I d = " 1 7 0 5 6 7 2 8 4 1 "   D a t a T y p e = " L a b e l " > C o n f i r m T o C a p t i o n _ L b l < / C o n f i r m T o C a p t i o n _ L b l > + 
+         < D i m T e x t   E l e m e n t T y p e = " C o l u m n "   E l e m e n t I d = " 1 7 6 4 8 3 2 3 2 "   D a t a T y p e = " T e x t " > D i m T e x t < / D i m T e x t > + 
+         < D o c T y p e _ P u r c h H e a d e r   E l e m e n t T y p e = " C o l u m n "   E l e m e n t I d = " 1 9 1 3 4 4 6 4 3 3 "   D a t a T y p e = " E n u m " > D o c T y p e _ P u r c h H e a d e r < / D o c T y p e _ P u r c h H e a d e r > + 
+         < D o c u m e n t D a t e   E l e m e n t T y p e = " C o l u m n "   E l e m e n t I d = " 5 5 2 8 7 1 9 1 4 "   D a t a T y p e = " S t r i n g " > D o c u m e n t D a t e < / D o c u m e n t D a t e > + 
+         < D o c u m e n t D a t e _ L b l   E l e m e n t T y p e = " C o l u m n "   E l e m e n t I d = " 1 0 2 6 4 9 4 8 3 "   D a t a T y p e = " L a b e l " > D o c u m e n t D a t e _ L b l < / D o c u m e n t D a t e _ L b l > + 
+         < D o c u m e n t T i t l e _ L b l   E l e m e n t T y p e = " C o l u m n "   E l e m e n t I d = " 8 5 8 4 2 3 9 2 9 "   D a t a T y p e = " L a b e l " > D o c u m e n t T i t l e _ L b l < / D o c u m e n t T i t l e _ L b l > + 
+         < D u e D a t e   E l e m e n t T y p e = " C o l u m n "   E l e m e n t I d = " 7 4 5 1 7 0 2 0 3 "   D a t a T y p e = " S t r i n g " > D u e D a t e < / D u e D a t e > + 
+         < E m a i l I D _ L b l   E l e m e n t T y p e = " C o l u m n "   E l e m e n t I d = " 1 0 8 1 3 5 7 8 8 9 "   D a t a T y p e = " L a b e l " > E m a i l I D _ L b l < / E m a i l I D _ L b l > + 
+         < E x p t R e c p t D t _ P u r c h a s e H e a d e r   E l e m e n t T y p e = " C o l u m n "   E l e m e n t I d = " 7 5 1 5 1 3 9 8 3 "   D a t a T y p e = " S t r i n g " > E x p t R e c p t D t _ P u r c h a s e H e a d e r < / E x p t R e c p t D t _ P u r c h a s e H e a d e r > + 
+         < H o m e P a g e _ L b l   E l e m e n t T y p e = " C o l u m n "   E l e m e n t I d = " 1 4 3 3 5 9 2 3 0 0 "   D a t a T y p e = " L a b e l " > H o m e P a g e _ L b l < / H o m e P a g e _ L b l > + 
+         < I t e m D e s c r i p t i o n _ L b l   E l e m e n t T y p e = " C o l u m n "   E l e m e n t I d = " 8 3 5 8 4 5 8 5 3 "   D a t a T y p e = " L a b e l " > I t e m D e s c r i p t i o n _ L b l < / I t e m D e s c r i p t i o n _ L b l > + 
+         < I t e m L i n e A m o u n t _ L b l   E l e m e n t T y p e = " C o l u m n "   E l e m e n t I d = " 4 8 8 7 0 7 2 7 "   D a t a T y p e = " L a b e l " > I t e m L i n e A m o u n t _ L b l < / I t e m L i n e A m o u n t _ L b l > + 
+         < I t e m N u m b e r _ L b l   E l e m e n t T y p e = " C o l u m n "   E l e m e n t I d = " 1 3 3 2 2 2 5 7 7 4 "   D a t a T y p e = " L a b e l " > I t e m N u m b e r _ L b l < / I t e m N u m b e r _ L b l > + 
+         < I t e m Q u a n t i t y _ L b l   E l e m e n t T y p e = " C o l u m n "   E l e m e n t I d = " 1 8 0 2 5 9 1 7 6 6 "   D a t a T y p e = " L a b e l " > I t e m Q u a n t i t y _ L b l < / I t e m Q u a n t i t y _ L b l > + 
+         < I t e m U n i t P r i c e _ L b l   E l e m e n t T y p e = " C o l u m n "   E l e m e n t I d = " 4 6 6 8 5 2 9 8 "   D a t a T y p e = " L a b e l " > I t e m U n i t P r i c e _ L b l < / I t e m U n i t P r i c e _ L b l > + 
+         < I t e m U n i t _ L b l   E l e m e n t T y p e = " C o l u m n "   E l e m e n t I d = " 1 9 8 1 4 0 3 7 7 3 "   D a t a T y p e = " L a b e l " > I t e m U n i t _ L b l < / I t e m U n i t _ L b l > + 
+         < N o _ P u r c h H e a d e r   E l e m e n t T y p e = " C o l u m n "   E l e m e n t I d = " 5 2 0 3 3 9 3 5 2 "   D a t a T y p e = " C o d e " > N o _ P u r c h H e a d e r < / N o _ P u r c h H e a d e r > + 
+         < O u t p u t N o   E l e m e n t T y p e = " C o l u m n "   E l e m e n t I d = " 1 5 2 4 6 3 6 1 8 1 "   D a t a T y p e = " I n t e g e r " > O u t p u t N o < / O u t p u t N o > + 
+         < P a g e _ L b l   E l e m e n t T y p e = " C o l u m n "   E l e m e n t I d = " 6 8 0 6 4 8 0 9 1 "   D a t a T y p e = " L a b e l " > P a g e _ L b l < / P a g e _ L b l > + 
+         < P a y m e n t D e t a i l s _ L b l   E l e m e n t T y p e = " C o l u m n "   E l e m e n t I d = " 1 0 2 9 7 4 8 9 9 2 "   D a t a T y p e = " L a b e l " > P a y m e n t D e t a i l s _ L b l < / P a y m e n t D e t a i l s _ L b l > + 
+         < P a y m e n t T e r m s D e s c   E l e m e n t T y p e = " C o l u m n "   E l e m e n t I d = " 1 9 8 3 0 0 2 7 7 9 "   D a t a T y p e = " T e x t " > P a y m e n t T e r m s D e s c < / P a y m e n t T e r m s D e s c > + 
+         < P a y m e n t T e r m s D e s c _ L b l   E l e m e n t T y p e = " C o l u m n "   E l e m e n t I d = " 1 4 3 7 8 0 9 5 6 2 "   D a t a T y p e = " L a b e l " > P a y m e n t T e r m s D e s c _ L b l < / P a y m e n t T e r m s D e s c _ L b l > + 
+         < P a y T o C o n t a c t E m a i l   E l e m e n t T y p e = " C o l u m n "   E l e m e n t I d = " 1 9 8 4 8 9 3 3 1 0 "   D a t a T y p e = " T e x t " > P a y T o C o n t a c t E m a i l < / P a y T o C o n t a c t E m a i l > + 
+         < P a y T o C o n t a c t E m a i l L b l   E l e m e n t T y p e = " C o l u m n "   E l e m e n t I d = " 6 8 4 6 8 8 4 8 "   D a t a T y p e = " L a b e l " > P a y T o C o n t a c t E m a i l L b l < / P a y T o C o n t a c t E m a i l L b l > + 
+         < P a y T o C o n t a c t M o b i l e P h o n e N o   E l e m e n t T y p e = " C o l u m n "   E l e m e n t I d = " 1 9 0 1 4 6 6 0 5 "   D a t a T y p e = " T e x t " > P a y T o C o n t a c t M o b i l e P h o n e N o < / P a y T o C o n t a c t M o b i l e P h o n e N o > + 
+         < P a y T o C o n t a c t M o b i l e P h o n e N o L b l   E l e m e n t T y p e = " C o l u m n "   E l e m e n t I d = " 1 2 5 4 4 4 0 0 8 9 "   D a t a T y p e = " L a b e l " > P a y T o C o n t a c t M o b i l e P h o n e N o L b l < / P a y T o C o n t a c t M o b i l e P h o n e N o L b l > + 
+         < P a y T o C o n t a c t P h o n e N o   E l e m e n t T y p e = " C o l u m n "   E l e m e n t I d = " 1 9 2 3 7 9 6 7 0 9 "   D a t a T y p e = " T e x t " > P a y T o C o n t a c t P h o n e N o < / P a y T o C o n t a c t P h o n e N o > + 
+         < P a y T o C o n t a c t P h o n e N o L b l   E l e m e n t T y p e = " C o l u m n "   E l e m e n t I d = " 2 9 3 4 6 1 0 8 7 "   D a t a T y p e = " L a b e l " > P a y T o C o n t a c t P h o n e N o L b l < / P a y T o C o n t a c t P h o n e N o L b l > + 
+         < P a y T o V e n d N o _ P u r c h H e a d e r   E l e m e n t T y p e = " C o l u m n "   E l e m e n t I d = " 6 3 5 5 6 4 4 9 8 "   D a t a T y p e = " C o d e " > P a y T o V e n d N o _ P u r c h H e a d e r < / P a y T o V e n d N o _ P u r c h H e a d e r > + 
+         < P r e p m t P a y m e n t T e r m s D e s c   E l e m e n t T y p e = " C o l u m n "   E l e m e n t I d = " 4 2 9 7 6 4 9 1 "   D a t a T y p e = " T e x t " > P r e p m t P a y m e n t T e r m s D e s c < / P r e p m t P a y m e n t T e r m s D e s c > + 
+         < P r e p m t T e r m s D e s c _ L b l   E l e m e n t T y p e = " C o l u m n "   E l e m e n t I d = " 1 9 1 4 0 0 6 7 7 8 "   D a t a T y p e = " L a b e l " > P r e p m t T e r m s D e s c _ L b l < / P r e p m t T e r m s D e s c _ L b l > + 
+         < P r i c e s I n c l u d i n g V A T _ L b l   E l e m e n t T y p e = " C o l u m n "   E l e m e n t I d = " 1 3 7 7 9 7 9 4 4 4 "   D a t a T y p e = " L a b e l " > P r i c e s I n c l u d i n g V A T _ L b l < / P r i c e s I n c l u d i n g V A T _ L b l > + 
+         < P r i c e s I n c l V A T t x t   E l e m e n t T y p e = " C o l u m n "   E l e m e n t I d = " 1 1 2 3 7 2 4 4 4 8 "   D a t a T y p e = " L a b e l " > P r i c e s I n c l V A T t x t < / P r i c e s I n c l V A T t x t > + 
+         < P r i c e s I n c l V A T _ P u r c h H e a d e r   E l e m e n t T y p e = " C o l u m n "   E l e m e n t I d = " 1 8 0 5 5 0 7 9 8 0 "   D a t a T y p e = " B o o l e a n " > P r i c e s I n c l V A T _ P u r c h H e a d e r < / P r i c e s I n c l V A T _ P u r c h H e a d e r > + 
+         < P r i c e s I n c l V A T _ P u r c h H e a d e r _ L b l   E l e m e n t T y p e = " C o l u m n "   E l e m e n t I d = " 1 7 9 9 5 0 1 7 4 3 "   D a t a T y p e = " S t r i n g " > P r i c e s I n c l V A T _ P u r c h H e a d e r _ L b l < / P r i c e s I n c l V A T _ P u r c h H e a d e r _ L b l > + 
+         < P u r c h a s e r T e x t   E l e m e n t T y p e = " C o l u m n "   E l e m e n t I d = " 1 2 9 1 4 2 3 8 3 3 "   D a t a T y p e = " T e x t " > P u r c h a s e r T e x t < / P u r c h a s e r T e x t > + 
+         < P u r c h L i n e I n v D i s c A m t _ L b l   E l e m e n t T y p e = " C o l u m n "   E l e m e n t I d = " 9 2 6 7 0 5 4 6 2 "   D a t a T y p e = " L a b e l " > P u r c h L i n e I n v D i s c A m t _ L b l < / P u r c h L i n e I n v D i s c A m t _ L b l > + 
+         < P u r c h Q u o t e C a p t i o n _ L b l   E l e m e n t T y p e = " C o l u m n "   E l e m e n t I d = " 7 9 9 0 6 9 8 5 6 "   D a t a T y p e = " L a b e l " > P u r c h Q u o t e C a p t i o n _ L b l < / P u r c h Q u o t e C a p t i o n _ L b l > + 
+         < P u r c h Q u o t e D a t e C a p t i o n _ L b l   E l e m e n t T y p e = " C o l u m n "   E l e m e n t I d = " 4 0 1 6 4 2 4 9 2 "   D a t a T y p e = " L a b e l " > P u r c h Q u o t e D a t e C a p t i o n _ L b l < / P u r c h Q u o t e D a t e C a p t i o n _ L b l > + 
+         < P u r c h Q u o t e N u m C a p t i o n _ L b l   E l e m e n t T y p e = " C o l u m n "   E l e m e n t I d = " 1 6 6 5 3 0 7 5 8 "   D a t a T y p e = " L a b e l " > P u r c h Q u o t e N u m C a p t i o n _ L b l < / P u r c h Q u o t e N u m C a p t i o n _ L b l > + 
+         < Q u o t e D a t e _ L b l   E l e m e n t T y p e = " C o l u m n "   E l e m e n t I d = " 1 4 3 5 5 3 2 0 6 "   D a t a T y p e = " L a b e l " > Q u o t e D a t e _ L b l < / Q u o t e D a t e _ L b l > + 
+         < Q u o t e N o _ L b l   E l e m e n t T y p e = " C o l u m n "   E l e m e n t I d = " 1 0 3 1 9 0 2 3 5 7 "   D a t a T y p e = " L a b e l " > Q u o t e N o _ L b l < / Q u o t e N o _ L b l > + 
+         < R e c e i v e b y _ L b l   E l e m e n t T y p e = " C o l u m n "   E l e m e n t I d = " 9 4 4 0 6 3 6 8 "   D a t a T y p e = " L a b e l " > R e c e i v e b y _ L b l < / R e c e i v e b y _ L b l > + 
+         < R e f e r e n c e T e x t   E l e m e n t T y p e = " C o l u m n "   E l e m e n t I d = " 4 4 5 3 5 3 4 5 1 "   D a t a T y p e = " T e x t " > R e f e r e n c e T e x t < / R e f e r e n c e T e x t > + 
+         < S a l e s P u r c h P e r s o n N a m e   E l e m e n t T y p e = " C o l u m n "   E l e m e n t I d = " 1 3 7 3 7 6 8 5 5 7 "   D a t a T y p e = " T e x t " > S a l e s P u r c h P e r s o n N a m e < / S a l e s P u r c h P e r s o n N a m e > + 
+         < S e l l T o C u s t N o _ P u r c h H e a d e r   E l e m e n t T y p e = " C o l u m n "   E l e m e n t I d = " 9 6 4 8 7 3 2 0 4 "   D a t a T y p e = " C o d e " > S e l l T o C u s t N o _ P u r c h H e a d e r < / S e l l T o C u s t N o _ P u r c h H e a d e r > + 
+         < S e l l T o C u s t N o _ P u r c h H e a d e r _ L b l   E l e m e n t T y p e = " C o l u m n "   E l e m e n t I d = " 1 9 3 1 5 7 0 8 9 7 "   D a t a T y p e = " S t r i n g " > S e l l T o C u s t N o _ P u r c h H e a d e r _ L b l < / S e l l T o C u s t N o _ P u r c h H e a d e r _ L b l > + 
+         < S h i p m e n t M e t h o d D e s c   E l e m e n t T y p e = " C o l u m n "   E l e m e n t I d = " 6 8 6 3 4 3 1 7 9 "   D a t a T y p e = " T e x t " > S h i p m e n t M e t h o d D e s c < / S h i p m e n t M e t h o d D e s c > + 
+         < S h i p m e n t M e t h o d D e s c _ L b l   E l e m e n t T y p e = " C o l u m n "   E l e m e n t I d = " 5 7 9 9 0 1 3 6 6 "   D a t a T y p e = " L a b e l " > S h i p m e n t M e t h o d D e s c _ L b l < / S h i p m e n t M e t h o d D e s c _ L b l > + 
+         < S h i p T o A d d r 1   E l e m e n t T y p e = " C o l u m n "   E l e m e n t I d = " 5 1 2 9 7 9 8 5 0 "   D a t a T y p e = " T e x t " > S h i p T o A d d r 1 < / S h i p T o A d d r 1 > + 
+         < S h i p T o A d d r 2   E l e m e n t T y p e = " C o l u m n "   E l e m e n t I d = " 1 1 5 0 6 7 6 4 6 7 "   D a t a T y p e = " T e x t " > S h i p T o A d d r 2 < / S h i p T o A d d r 2 > + 
+         < S h i p T o A d d r 3   E l e m e n t T y p e = " C o l u m n "   E l e m e n t I d = " 1 7 8 8 3 7 3 0 8 4 "   D a t a T y p e = " T e x t " > S h i p T o A d d r 3 < / S h i p T o A d d r 3 > + 
+         < S h i p T o A d d r 4   E l e m e n t T y p e = " C o l u m n "   E l e m e n t I d = " 1 8 6 8 8 9 7 5 9 5 "   D a t a T y p e = " T e x t " > S h i p T o A d d r 4 < / S h i p T o A d d r 4 > + 
+         < S h i p T o A d d r 5   E l e m e n t T y p e = " C o l u m n "   E l e m e n t I d = " 1 2 3 1 2 0 0 9 7 8 "   D a t a T y p e = " T e x t " > S h i p T o A d d r 5 < / S h i p T o A d d r 5 > + 
+         < S h i p T o A d d r 6   E l e m e n t T y p e = " C o l u m n "   E l e m e n t I d = " 5 9 3 5 0 4 3 6 1 "   D a t a T y p e = " T e x t " > S h i p T o A d d r 6 < / S h i p T o A d d r 6 > + 
+         < S h i p T o A d d r 7   E l e m e n t T y p e = " C o l u m n "   E l e m e n t I d = " 4 4 1 9 2 2 5 6 "   D a t a T y p e = " T e x t " > S h i p T o A d d r 7 < / S h i p T o A d d r 7 > + 
+         < S h i p T o A d d r 8   E l e m e n t T y p e = " C o l u m n "   E l e m e n t I d = " 9 3 1 3 2 2 4 0 7 "   D a t a T y p e = " T e x t " > S h i p T o A d d r 8 < / S h i p T o A d d r 8 > + 
+         < S h i p t o A d d r e s s _ L b l   E l e m e n t T y p e = " C o l u m n "   E l e m e n t I d = " 1 0 4 3 5 1 9 5 7 7 "   D a t a T y p e = " L a b e l " > S h i p t o A d d r e s s _ L b l < / S h i p t o A d d r e s s _ L b l > + 
+         < S u b t o t a l _ L b l   E l e m e n t T y p e = " C o l u m n "   E l e m e n t I d = " 1 9 6 7 7 9 5 1 4 2 "   D a t a T y p e = " L a b e l " > S u b t o t a l _ L b l < / S u b t o t a l _ L b l > + 
+         < T a x I d e n t T y p e C a p t i o n _ L b l   E l e m e n t T y p e = " C o l u m n "   E l e m e n t I d = " 1 2 3 4 9 8 1 3 2 1 "   D a t a T y p e = " L a b e l " > T a x I d e n t T y p e C a p t i o n _ L b l < / T a x I d e n t T y p e C a p t i o n _ L b l > + 
+         < T o C a p t i o n _ L b l   E l e m e n t T y p e = " C o l u m n "   E l e m e n t I d = " 2 0 3 0 5 3 2 2 2 9 "   D a t a T y p e = " L a b e l " > T o C a p t i o n _ L b l < / T o C a p t i o n _ L b l > + 
+         < T o t a l _ L b l   E l e m e n t T y p e = " C o l u m n "   E l e m e n t I d = " 1 2 1 0 1 0 0 8 7 8 "   D a t a T y p e = " L a b e l " > T o t a l _ L b l < / T o t a l _ L b l > + 
+         < V A L V A T B a s e L C Y _ L b l   E l e m e n t T y p e = " C o l u m n "   E l e m e n t I d = " 1 7 0 5 4 3 5 8 1 1 "   D a t a T y p e = " L a b e l " > V A L V A T B a s e L C Y _ L b l < / V A L V A T B a s e L C Y _ L b l > + 
+         < V A T A m t L i n e I n v D i s c B a s e A m t _ L b l   E l e m e n t T y p e = " C o l u m n "   E l e m e n t I d = " 1 6 4 7 3 8 4 9 1 6 "   D a t a T y p e = " L a b e l " > V A T A m t L i n e I n v D i s c B a s e A m t _ L b l < / V A T A m t L i n e I n v D i s c B a s e A m t _ L b l > + 
+         < V A T A m t L i n e L i n e A m t _ L b l   E l e m e n t T y p e = " C o l u m n "   E l e m e n t I d = " 1 1 3 2 2 4 5 2 5 1 "   D a t a T y p e = " L a b e l " > V A T A m t L i n e L i n e A m t _ L b l < / V A T A m t L i n e L i n e A m t _ L b l > + 
+         < V A T A m t L i n e V A T A m t _ L b l   E l e m e n t T y p e = " C o l u m n "   E l e m e n t I d = " 5 0 9 5 8 8 9 9 8 "   D a t a T y p e = " L a b e l " > V A T A m t L i n e V A T A m t _ L b l < / V A T A m t L i n e V A T A m t _ L b l > + 
+         < V A T A m t L i n e V A T _ L b l   E l e m e n t T y p e = " C o l u m n "   E l e m e n t I d = " 1 1 6 2 6 0 3 1 0 2 "   D a t a T y p e = " L a b e l " > V A T A m t L i n e V A T _ L b l < / V A T A m t L i n e V A T _ L b l > + 
+         < V A T A m t S p e c _ L b l   E l e m e n t T y p e = " C o l u m n "   E l e m e n t I d = " 1 5 0 9 9 9 9 3 4 6 "   D a t a T y p e = " L a b e l " > V A T A m t S p e c _ L b l < / V A T A m t S p e c _ L b l > + 
+         < V A T B a s e D i s c _ P u r c h H e a d e r   E l e m e n t T y p e = " C o l u m n "   E l e m e n t I d = " 1 6 3 9 7 3 7 3 5 8 "   D a t a T y p e = " D e c i m a l " > V A T B a s e D i s c _ P u r c h H e a d e r < / V A T B a s e D i s c _ P u r c h H e a d e r > + 
+         < V A T I d e n t i f i e r _ L b l   E l e m e n t T y p e = " C o l u m n "   E l e m e n t I d = " 1 6 8 6 6 2 3 9 8 4 "   D a t a T y p e = " L a b e l " > V A T I d e n t i f i e r _ L b l < / V A T I d e n t i f i e r _ L b l > + 
+         < V A T N o T e x t   E l e m e n t T y p e = " C o l u m n "   E l e m e n t I d = " 1 9 5 9 6 6 3 4 2 6 "   D a t a T y p e = " T e x t " > V A T N o T e x t < / V A T N o T e x t > + 
+         < V A T R e g N o _ P u r c h H e a d e r   E l e m e n t T y p e = " C o l u m n "   E l e m e n t I d = " 9 8 5 0 3 8 1 8 7 "   D a t a T y p e = " T e x t " > V A T R e g N o _ P u r c h H e a d e r < / V A T R e g N o _ P u r c h H e a d e r > + 
+         < V e n d A d d r 1   E l e m e n t T y p e = " C o l u m n "   E l e m e n t I d = " 2 0 3 8 5 3 5 7 8 "   D a t a T y p e = " T e x t " > V e n d A d d r 1 < / V e n d A d d r 1 > + 
+         < V e n d A d d r 2   E l e m e n t T y p e = " C o l u m n "   E l e m e n t I d = " 8 4 1 5 5 0 1 9 5 "   D a t a T y p e = " T e x t " > V e n d A d d r 2 < / V e n d A d d r 2 > + 
+         < V e n d A d d r 3   E l e m e n t T y p e = " C o l u m n "   E l e m e n t I d = " 1 4 7 9 2 4 6 8 1 2 "   D a t a T y p e = " T e x t " > V e n d A d d r 3 < / V e n d A d d r 3 > + 
+         < V e n d A d d r 4   E l e m e n t T y p e = " C o l u m n "   E l e m e n t I d = " 2 1 1 6 9 4 3 4 2 9 "   D a t a T y p e = " T e x t " > V e n d A d d r 4 < / V e n d A d d r 4 > + 
+         < V e n d A d d r 5   E l e m e n t T y p e = " C o l u m n "   E l e m e n t I d = " 1 5 4 0 3 2 7 2 5 0 "   D a t a T y p e = " T e x t " > V e n d A d d r 5 < / V e n d A d d r 5 > + 
+         < V e n d A d d r 6   E l e m e n t T y p e = " C o l u m n "   E l e m e n t I d = " 9 0 2 6 3 0 6 3 3 "   D a t a T y p e = " T e x t " > V e n d A d d r 6 < / V e n d A d d r 6 > + 
+         < V e n d A d d r 7   E l e m e n t T y p e = " C o l u m n "   E l e m e n t I d = " 2 6 4 9 3 4 0 1 6 "   D a t a T y p e = " T e x t " > V e n d A d d r 7 < / V e n d A d d r 7 > + 
+         < V e n d A d d r 8   E l e m e n t T y p e = " C o l u m n "   E l e m e n t I d = " 1 2 4 0 4 4 8 6 7 9 "   D a t a T y p e = " T e x t " > V e n d A d d r 8 < / V e n d A d d r 8 > + 
+         < V e n d N o _ L b l   E l e m e n t T y p e = " C o l u m n "   E l e m e n t I d = " 1 1 9 1 1 1 2 2 4 0 "   D a t a T y p e = " L a b e l " > V e n d N o _ L b l < / V e n d N o _ L b l > + 
+         < V e n d o r I D C a p t i o n _ L b l   E l e m e n t T y p e = " C o l u m n "   E l e m e n t I d = " 1 1 2 9 2 1 9 5 9 3 "   D a t a T y p e = " L a b e l " > V e n d o r I D C a p t i o n _ L b l < / V e n d o r I D C a p t i o n _ L b l > + 
+         < V e n d o r I n v o i c e N o   E l e m e n t T y p e = " C o l u m n "   E l e m e n t I d = " 8 8 7 3 7 6 2 2 5 "   D a t a T y p e = " C o d e " > V e n d o r I n v o i c e N o < / V e n d o r I n v o i c e N o > + 
+         < V e n d o r I n v o i c e N o _ L b l   E l e m e n t T y p e = " C o l u m n "   E l e m e n t I d = " 1 0 3 4 9 0 0 7 0 0 "   D a t a T y p e = " L a b e l " > V e n d o r I n v o i c e N o _ L b l < / V e n d o r I n v o i c e N o _ L b l > + 
+         < V e n d o r Q u o t e N o _ L b l   E l e m e n t T y p e = " C o l u m n "   E l e m e n t I d = " 1 5 8 6 5 5 4 3 1 3 "   D a t a T y p e = " L a b e l " > V e n d o r Q u o t e N o _ L b l < / V e n d o r Q u o t e N o _ L b l > + 
+         < w a n B u y F r o m A d d r e s s   E l e m e n t T y p e = " C o l u m n "   E l e m e n t I d = " 7 4 5 4 1 5 0 1 9 "   D a t a T y p e = " T e x t " > w a n B u y F r o m A d d r e s s < / w a n B u y F r o m A d d r e s s > + 
+         < w a n B u y F r o m A d d r e s s _ L b l   E l e m e n t T y p e = " C o l u m n "   E l e m e n t I d = " 7 9 7 5 6 3 5 4 2 "   D a t a T y p e = " L a b e l " > w a n B u y F r o m A d d r e s s _ L b l < / w a n B u y F r o m A d d r e s s _ L b l > + 
+         < w a n C o m p a n y A d d r e s s   E l e m e n t T y p e = " C o l u m n "   E l e m e n t I d = " 2 0 9 2 2 7 1 6 4 "   D a t a T y p e = " T e x t " > w a n C o m p a n y A d d r e s s < / w a n C o m p a n y A d d r e s s > + 
+         < w a n C o m p a n y C o n t a c t I n f o   E l e m e n t T y p e = " C o l u m n "   E l e m e n t I d = " 1 1 1 9 2 3 4 2 7 6 "   D a t a T y p e = " T e x t " > w a n C o m p a n y C o n t a c t I n f o < / w a n C o m p a n y C o n t a c t I n f o > + 
+         < w a n C o m p a n y L e g a l I n f o   E l e m e n t T y p e = " C o l u m n "   E l e m e n t I d = " 1 5 3 9 5 4 1 8 8 7 "   D a t a T y p e = " T e x t " > w a n C o m p a n y L e g a l I n f o < / w a n C o m p a n y L e g a l I n f o > + 
+         < w a n P a y T o A d d r e s s   E l e m e n t T y p e = " C o l u m n "   E l e m e n t I d = " 1 3 4 7 5 5 4 0 7 2 "   D a t a T y p e = " T e x t " > w a n P a y T o A d d r e s s < / w a n P a y T o A d d r e s s > + 
+         < w a n P a y T o A d d r e s s _ L b l   E l e m e n t T y p e = " C o l u m n "   E l e m e n t I d = " 1 5 6 5 0 6 7 "   D a t a T y p e = " L a b e l " > w a n P a y T o A d d r e s s _ L b l < / w a n P a y T o A d d r e s s _ L b l > + 
+         < w a n S h i p T o A d d r e s s   E l e m e n t T y p e = " C o l u m n "   E l e m e n t I d = " 7 4 3 5 9 4 0 1 8 "   D a t a T y p e = " T e x t " > w a n S h i p T o A d d r e s s < / w a n S h i p T o A d d r e s s > + 
+         < w a n S h i p T o A d d r e s s _ L b l   E l e m e n t T y p e = " C o l u m n "   E l e m e n t I d = " 1 6 1 7 8 8 9 9 8 3 "   D a t a T y p e = " L a b e l " > w a n S h i p T o A d d r e s s _ L b l < / w a n S h i p T o A d d r e s s _ L b l > + 
+         < w a n V e r s i o n   E l e m e n t T y p e = " C o l u m n "   E l e m e n t I d = " 1 1 0 0 2 7 7 8 1 7 "   D a t a T y p e = " T e x t " > w a n V e r s i o n < / w a n V e r s i o n > + 
+         < Y o u r R e f _ P u r c h H e a d e r   E l e m e n t T y p e = " C o l u m n "   E l e m e n t I d = " 1 9 8 5 3 6 8 6 3 1 "   D a t a T y p e = " T e x t " > Y o u r R e f _ P u r c h H e a d e r < / Y o u r R e f _ P u r c h H e a d e r > + 
+         < P u r c h a s e _ L i n e   E l e m e n t T y p e = " D a t a I t e m "   E l e m e n t I d = " 1 2 9 1 3 1 7 9 1 1 " > + 
+             < A l l o w I n v D i s c t x t   E l e m e n t T y p e = " C o l u m n "   E l e m e n t I d = " 2 0 1 2 9 2 1 6 0 8 "   D a t a T y p e = " T e x t " > A l l o w I n v D i s c t x t < / A l l o w I n v D i s c t x t > + 
+             < A l l o w I n v D i s c _ P u r c h L i n e   E l e m e n t T y p e = " C o l u m n "   E l e m e n t I d = " 9 8 2 2 2 1 3 6 3 "   D a t a T y p e = " B o o l e a n " > A l l o w I n v D i s c _ P u r c h L i n e < / A l l o w I n v D i s c _ P u r c h L i n e > + 
+             < A m o u n t I n c l u d i n g V A T   E l e m e n t T y p e = " C o l u m n "   E l e m e n t I d = " 8 9 1 0 4 9 5 7 1 "   D a t a T y p e = " D e c i m a l " > A m o u n t I n c l u d i n g V A T < / A m o u n t I n c l u d i n g V A T > + 
+             < D e s c _ P u r c h L i n e   E l e m e n t T y p e = " C o l u m n "   E l e m e n t I d = " 1 1 6 1 7 0 2 0 8 9 "   D a t a T y p e = " T e x t " > D e s c _ P u r c h L i n e < / D e s c _ P u r c h L i n e > + 
+             < D e s c _ P u r c h L i n e _ L b l   E l e m e n t T y p e = " C o l u m n "   E l e m e n t I d = " 6 6 5 1 1 3 6 5 2 "   D a t a T y p e = " S t r i n g " > D e s c _ P u r c h L i n e _ L b l < / D e s c _ P u r c h L i n e _ L b l > + 
+             < D i r e c t U n i C o s t _ L b l   E l e m e n t T y p e = " C o l u m n "   E l e m e n t I d = " 7 2 1 4 7 6 6 8 4 "   D a t a T y p e = " L a b e l " > D i r e c t U n i C o s t _ L b l < / D i r e c t U n i C o s t _ L b l > + 
+             < D i r U n i t C o s t _ P u r c h L i n e   E l e m e n t T y p e = " C o l u m n "   E l e m e n t I d = " 9 5 0 9 6 2 5 8 6 "   D a t a T y p e = " T e x t " > D i r U n i t C o s t _ P u r c h L i n e < / D i r U n i t C o s t _ P u r c h L i n e > + 
+             < E x p e c t e d R e c e i p t D a t e   E l e m e n t T y p e = " C o l u m n "   E l e m e n t I d = " 1 9 8 8 0 4 6 2 0 5 "   D a t a T y p e = " S t r i n g " > E x p e c t e d R e c e i p t D a t e < / E x p e c t e d R e c e i p t D a t e > + 
+             < E x p e c t e d R e c e i p t D a t e L b l   E l e m e n t T y p e = " C o l u m n "   E l e m e n t I d = " 1 8 0 6 8 4 1 2 7 1 "   D a t a T y p e = " L a b e l " > E x p e c t e d R e c e i p t D a t e L b l < / E x p e c t e d R e c e i p t D a t e L b l > + 
+             < I n v D i s c A m t _ P u r c h L i n e   E l e m e n t T y p e = " C o l u m n "   E l e m e n t I d = " 1 4 5 3 0 9 9 5 8 0 "   D a t a T y p e = " D e c i m a l " > I n v D i s c A m t _ P u r c h L i n e < / I n v D i s c A m t _ P u r c h L i n e > + 
+             < I n v D i s c C a p t i o n _ L b l   E l e m e n t T y p e = " C o l u m n "   E l e m e n t I d = " 1 9 3 9 0 5 8 9 7 4 "   D a t a T y p e = " L a b e l " > I n v D i s c C a p t i o n _ L b l < / I n v D i s c C a p t i o n _ L b l > + 
+             < I t e m N o _ P u r c h L i n e   E l e m e n t T y p e = " C o l u m n "   E l e m e n t I d = " 1 0 5 7 2 2 4 1 4 0 "   D a t a T y p e = " C o d e " > I t e m N o _ P u r c h L i n e < / I t e m N o _ P u r c h L i n e > + 
+             < I t e m R e f e r e n c e N o _ P u r c h L i n e   E l e m e n t T y p e = " C o l u m n "   E l e m e n t I d = " 1 1 5 8 3 9 2 0 3 1 "   D a t a T y p e = " C o d e " > I t e m R e f e r e n c e N o _ P u r c h L i n e < / I t e m R e f e r e n c e N o _ P u r c h L i n e > + 
+             < J o b N o _ P u r c h L i n e   E l e m e n t T y p e = " C o l u m n "   E l e m e n t I d = " 2 7 7 7 0 3 3 2 6 "   D a t a T y p e = " C o d e " > J o b N o _ P u r c h L i n e < / J o b N o _ P u r c h L i n e > + 
+             < J o b N o _ P u r c h L i n e _ L b l   E l e m e n t T y p e = " C o l u m n "   E l e m e n t I d = " 9 6 0 0 7 3 4 1 1 "   D a t a T y p e = " L a b e l " > J o b N o _ P u r c h L i n e _ L b l < / J o b N o _ P u r c h L i n e _ L b l > + 
+             < J o b T a s k N o _ P u r c h L i n e   E l e m e n t T y p e = " C o l u m n "   E l e m e n t I d = " 7 2 6 6 6 9 0 1 1 "   D a t a T y p e = " C o d e " > J o b T a s k N o _ P u r c h L i n e < / J o b T a s k N o _ P u r c h L i n e > + 
+             < J o b T a s k N o _ P u r c h L i n e _ L b l   E l e m e n t T y p e = " C o l u m n "   E l e m e n t I d = " 2 0 4 9 1 3 1 1 8 2 "   D a t a T y p e = " L a b e l " > J o b T a s k N o _ P u r c h L i n e _ L b l < / J o b T a s k N o _ P u r c h L i n e _ L b l > + 
+             < L i n e A m t _ P u r c h L i n e   E l e m e n t T y p e = " C o l u m n "   E l e m e n t I d = " 1 5 9 3 7 5 8 6 7 4 "   D a t a T y p e = " T e x t " > L i n e A m t _ P u r c h L i n e < / L i n e A m t _ P u r c h L i n e > + 
+             < L i n e D i s c _ P u r c h L i n e   E l e m e n t T y p e = " C o l u m n "   E l e m e n t I d = " 2 1 3 3 2 3 3 9 7 3 "   D a t a T y p e = " D e c i m a l " > L i n e D i s c _ P u r c h L i n e < / L i n e D i s c _ P u r c h L i n e > + 
+             < L i n e N o _ P u r c h L i n e   E l e m e n t T y p e = " C o l u m n "   E l e m e n t I d = " 1 7 4 8 8 4 8 6 5 "   D a t a T y p e = " I n t e g e r " > L i n e N o _ P u r c h L i n e < / L i n e N o _ P u r c h L i n e > + 
+             < N o _ P u r c h L i n e   E l e m e n t T y p e = " C o l u m n "   E l e m e n t I d = " 2 8 8 5 5 1 3 4 3 "   D a t a T y p e = " T e x t " > N o _ P u r c h L i n e < / N o _ P u r c h L i n e > + 
+             < N o _ P u r c h L i n e _ L b l   E l e m e n t T y p e = " C o l u m n "   E l e m e n t I d = " 1 8 4 4 9 0 6 5 4 0 "   D a t a T y p e = " S t r i n g " > N o _ P u r c h L i n e _ L b l < / N o _ P u r c h L i n e _ L b l > + 
+             < P l a n n e d R e c e i p t D a t e   E l e m e n t T y p e = " C o l u m n "   E l e m e n t I d = " 1 1 4 0 0 3 3 3 2 1 "   D a t a T y p e = " S t r i n g " > P l a n n e d R e c e i p t D a t e < / P l a n n e d R e c e i p t D a t e > + 
+             < P l a n n e d R e c e i p t D a t e L b l   E l e m e n t T y p e = " C o l u m n "   E l e m e n t I d = " 1 4 7 8 7 6 7 2 9 9 "   D a t a T y p e = " L a b e l " > P l a n n e d R e c e i p t D a t e L b l < / P l a n n e d R e c e i p t D a t e L b l > + 
+             < P r o m i s e d R e c e i p t D a t e   E l e m e n t T y p e = " C o l u m n "   E l e m e n t I d = " 2 9 4 5 3 0 7 8 "   D a t a T y p e = " S t r i n g " > P r o m i s e d R e c e i p t D a t e < / P r o m i s e d R e c e i p t D a t e > + 
+             < P r o m i s e d R e c e i p t D a t e L b l   E l e m e n t T y p e = " C o l u m n "   E l e m e n t I d = " 2 0 2 4 9 3 8 1 7 2 "   D a t a T y p e = " L a b e l " > P r o m i s e d R e c e i p t D a t e L b l < / P r o m i s e d R e c e i p t D a t e L b l > + 
+             < P u r c h L i n e L i n e D i s c _ L b l   E l e m e n t T y p e = " C o l u m n "   E l e m e n t I d = " 5 7 3 7 9 3 8 4 1 "   D a t a T y p e = " L a b e l " > P u r c h L i n e L i n e D i s c _ L b l < / P u r c h L i n e L i n e D i s c _ L b l > + 
+             < Q t y _ P u r c h L i n e   E l e m e n t T y p e = " C o l u m n "   E l e m e n t I d = " 7 8 0 8 5 8 6 7 6 "   D a t a T y p e = " T e x t " > Q t y _ P u r c h L i n e < / Q t y _ P u r c h L i n e > + 
+             < Q t y _ P u r c h L i n e _ L b l   E l e m e n t T y p e = " C o l u m n "   E l e m e n t I d = " 6 6 5 5 0 9 2 9 "   D a t a T y p e = " S t r i n g " > Q t y _ P u r c h L i n e _ L b l < / Q t y _ P u r c h L i n e _ L b l > + 
+             < R e q u e s t e d R e c e i p t D a t e   E l e m e n t T y p e = " C o l u m n "   E l e m e n t I d = " 9 3 3 1 1 2 9 3 1 "   D a t a T y p e = " S t r i n g " > R e q u e s t e d R e c e i p t D a t e < / R e q u e s t e d R e c e i p t D a t e > + 
+             < R e q u e s t e d R e c e i p t D a t e L b l   E l e m e n t T y p e = " C o l u m n "   E l e m e n t I d = " 1 4 4 2 7 6 8 2 3 "   D a t a T y p e = " L a b e l " > R e q u e s t e d R e c e i p t D a t e L b l < / R e q u e s t e d R e c e i p t D a t e L b l > + 
+             < T o t a l I n c l V A T   E l e m e n t T y p e = " C o l u m n "   E l e m e n t I d = " 2 0 6 6 5 7 4 0 8 4 "   D a t a T y p e = " D e c i m a l " > T o t a l I n c l V A T < / T o t a l I n c l V A T > + 
+             < T o t a l P r i c e C a p t i o n _ L b l   E l e m e n t T y p e = " C o l u m n "   E l e m e n t I d = " 1 7 4 8 7 7 2 0 5 5 "   D a t a T y p e = " L a b e l " > T o t a l P r i c e C a p t i o n _ L b l < / T o t a l P r i c e C a p t i o n _ L b l > + 
+             < T y p e _ P u r c h L i n e   E l e m e n t T y p e = " C o l u m n "   E l e m e n t I d = " 8 0 9 4 7 1 0 8 8 "   D a t a T y p e = " S t r i n g " > T y p e _ P u r c h L i n e < / T y p e _ P u r c h L i n e > + 
+             < U n i t P r i c e _ P u r c h L i n e   E l e m e n t T y p e = " C o l u m n "   E l e m e n t I d = " 2 0 6 3 2 5 9 8 1 9 "   D a t a T y p e = " D e c i m a l " > U n i t P r i c e _ P u r c h L i n e < / U n i t P r i c e _ P u r c h L i n e > + 
+             < U n i t P r i c e _ P u r c h L i n e _ L b l   E l e m e n t T y p e = " C o l u m n "   E l e m e n t I d = " 7 0 4 0 2 1 4 6 2 "   D a t a T y p e = " L a b e l " > U n i t P r i c e _ P u r c h L i n e _ L b l < / U n i t P r i c e _ P u r c h L i n e _ L b l > + 
+             < U O M _ P u r c h L i n e   E l e m e n t T y p e = " C o l u m n "   E l e m e n t I d = " 4 4 1 1 3 9 0 4 9 "   D a t a T y p e = " T e x t " > U O M _ P u r c h L i n e < / U O M _ P u r c h L i n e > + 
+             < U O M _ P u r c h L i n e _ L b l   E l e m e n t T y p e = " C o l u m n "   E l e m e n t I d = " 1 8 5 6 1 1 3 1 9 4 "   D a t a T y p e = " L a b e l " > U O M _ P u r c h L i n e _ L b l < / U O M _ P u r c h L i n e _ L b l > + 
+             < V A T D i s c o u n t A m o u n t _ L b l   E l e m e n t T y p e = " C o l u m n "   E l e m e n t I d = " 1 3 5 5 1 2 6 5 3 8 "   D a t a T y p e = " L a b e l " > V A T D i s c o u n t A m o u n t _ L b l < / V A T D i s c o u n t A m o u n t _ L b l > + 
+             < V A T I d e n t i f i e r _ P u r c h L i n e   E l e m e n t T y p e = " C o l u m n "   E l e m e n t I d = " 1 0 5 5 6 1 2 1 2 8 "   D a t a T y p e = " C o d e " > V A T I d e n t i f i e r _ P u r c h L i n e < / V A T I d e n t i f i e r _ P u r c h L i n e > + 
+             < V A T I d e n t i f i e r _ P u r c h L i n e _ L b l   E l e m e n t T y p e = " C o l u m n "   E l e m e n t I d = " 1 4 0 4 1 9 4 8 1 9 "   D a t a T y p e = " S t r i n g " > V A T I d e n t i f i e r _ P u r c h L i n e _ L b l < / V A T I d e n t i f i e r _ P u r c h L i n e _ L b l > + 
+             < V e n d o r I t e m N o _ P u r c h L i n e   E l e m e n t T y p e = " C o l u m n "   E l e m e n t I d = " 1 9 1 8 6 5 6 1 6 0 "   D a t a T y p e = " T e x t " > V e n d o r I t e m N o _ P u r c h L i n e < / V e n d o r I t e m N o _ P u r c h L i n e > + 
+             < w a n L i n e D i s c P e r c e n t   E l e m e n t T y p e = " C o l u m n "   E l e m e n t I d = " 1 2 9 7 1 8 5 7 9 "   D a t a T y p e = " T e x t " > w a n L i n e D i s c P e r c e n t < / w a n L i n e D i s c P e r c e n t > + 
+             < w a n M e m o P a d   E l e m e n t T y p e = " C o l u m n "   E l e m e n t I d = " 7 2 4 4 0 8 5 0 6 "   D a t a T y p e = " T e x t " > w a n M e m o P a d < / w a n M e m o P a d > + 
+             < w a n P r o m R c p t D a t e   E l e m e n t T y p e = " C o l u m n "   E l e m e n t I d = " 5 4 2 8 4 5 6 5 2 "   D a t a T y p e = " T e x t " > w a n P r o m R c p t D a t e < / w a n P r o m R c p t D a t e > + 
+             < w a n P r o m R c p t D a t e _ L b l   E l e m e n t T y p e = " C o l u m n "   E l e m e n t I d = " 2 0 0 1 2 7 8 4 7 9 "   D a t a T y p e = " S t r i n g " > w a n P r o m R c p t D a t e _ L b l < / w a n P r o m R c p t D a t e _ L b l > + 
+             < w a n Q u a n t i t y _ U O M   E l e m e n t T y p e = " C o l u m n "   E l e m e n t I d = " 1 4 7 2 0 9 1 8 9 4 "   D a t a T y p e = " T e x t " > w a n Q u a n t i t y _ U O M < / w a n Q u a n t i t y _ U O M > + 
+             < w a n R e q R c p t D a t e   E l e m e n t T y p e = " C o l u m n "   E l e m e n t I d = " 1 4 5 9 8 6 0 8 6 2 "   D a t a T y p e = " T e x t " > w a n R e q R c p t D a t e < / w a n R e q R c p t D a t e > + 
+             < w a n R e q R c p t D a t e _ L b l   E l e m e n t T y p e = " C o l u m n "   E l e m e n t I d = " 2 8 3 7 6 6 8 8 1 "   D a t a T y p e = " S t r i n g " > w a n R e q R c p t D a t e _ L b l < / w a n R e q R c p t D a t e _ L b l > + 
+             < w a n V A T P e r c e n t   E l e m e n t T y p e = " C o l u m n "   E l e m e n t I d = " 1 4 3 6 3 0 4 1 2 3 "   D a t a T y p e = " T e x t " > w a n V A T P e r c e n t < / w a n V A T P e r c e n t > + 
+             < w a n V A T P e r c e n t _ l b l   E l e m e n t T y p e = " C o l u m n "   E l e m e n t I d = " 2 1 2 9 7 8 8 0 0 8 "   D a t a T y p e = " S t r i n g " > w a n V A T P e r c e n t _ l b l < / w a n V A T P e r c e n t _ l b l > + 
+         < / P u r c h a s e _ L i n e > + 
+         < T o t a l s   E l e m e n t T y p e = " D a t a I t e m "   E l e m e n t I d = " 1 8 2 3 9 5 0 0 4 4 " > + 
+             < T o t a l A m o u n t   E l e m e n t T y p e = " C o l u m n "   E l e m e n t I d = " 1 5 5 9 1 6 4 8 7 7 "   D a t a T y p e = " D e c i m a l " > T o t a l A m o u n t < / T o t a l A m o u n t > + 
+             < T o t a l A m o u n t I n c l V A T   E l e m e n t T y p e = " C o l u m n "   E l e m e n t I d = " 1 4 2 2 4 2 7 9 5 2 "   D a t a T y p e = " D e c i m a l " > T o t a l A m o u n t I n c l V A T < / T o t a l A m o u n t I n c l V A T > + 
+             < T o t a l E x c l V A T T e x t   E l e m e n t T y p e = " C o l u m n "   E l e m e n t I d = " 1 3 8 4 8 1 6 4 5 "   D a t a T y p e = " T e x t " > T o t a l E x c l V A T T e x t < / T o t a l E x c l V A T T e x t > + 
+             < T o t a l I n c l V A T T e x t   E l e m e n t T y p e = " C o l u m n "   E l e m e n t I d = " 7 6 1 2 0 3 1 7 7 "   D a t a T y p e = " T e x t " > T o t a l I n c l V A T T e x t < / T o t a l I n c l V A T T e x t > + 
+             < T o t a l I n v o i c e D i s c o u n t A m o u n t   E l e m e n t T y p e = " C o l u m n "   E l e m e n t I d = " 4 0 2 1 7 7 5 1 "   D a t a T y p e = " D e c i m a l " > T o t a l I n v o i c e D i s c o u n t A m o u n t < / T o t a l I n v o i c e D i s c o u n t A m o u n t > + 
+             < T o t a l S u b T o t a l   E l e m e n t T y p e = " C o l u m n "   E l e m e n t I d = " 2 0 9 7 8 7 6 8 0 1 "   D a t a T y p e = " D e c i m a l " > T o t a l S u b T o t a l < / T o t a l S u b T o t a l > + 
+             < T o t a l T e x t   E l e m e n t T y p e = " C o l u m n "   E l e m e n t I d = " 2 3 1 9 1 0 5 1 8 "   D a t a T y p e = " T e x t " > T o t a l T e x t < / T o t a l T e x t > + 
+             < T o t a l V A T A m o u n t   E l e m e n t T y p e = " C o l u m n "   E l e m e n t I d = " 1 6 2 7 1 0 2 3 2 8 "   D a t a T y p e = " D e c i m a l " > T o t a l V A T A m o u n t < / T o t a l V A T A m o u n t > + 
+             < T o t a l V A T B a s e A m o u n t   E l e m e n t T y p e = " C o l u m n "   E l e m e n t I d = " 6 6 3 4 5 3 7 0 9 "   D a t a T y p e = " D e c i m a l " > T o t a l V A T B a s e A m o u n t < / T o t a l V A T B a s e A m o u n t > + 
+             < T o t a l V A T D i s c o u n t A m o u n t   E l e m e n t T y p e = " C o l u m n "   E l e m e n t I d = " 6 8 1 2 9 8 4 1 3 "   D a t a T y p e = " D e c i m a l " > T o t a l V A T D i s c o u n t A m o u n t < / T o t a l V A T D i s c o u n t A m o u n t > + 
+             < V A T A m o u n t T e x t   E l e m e n t T y p e = " C o l u m n "   E l e m e n t I d = " 6 5 0 3 5 8 2 4 7 "   D a t a T y p e = " T e x t " > V A T A m o u n t T e x t < / V A T A m o u n t T e x t > + 
+         < / T o t a l s > + 
+         < V A T C o u n t e r   E l e m e n t T y p e = " D a t a I t e m "   E l e m e n t I d = " 5 5 7 1 2 6 5 0 6 " > + 
+             < V A T A m t L i n e I n v D i s c A m t   E l e m e n t T y p e = " C o l u m n "   E l e m e n t I d = " 1 0 0 7 8 2 8 6 0 "   D a t a T y p e = " D e c i m a l " > V A T A m t L i n e I n v D i s c A m t < / V A T A m t L i n e I n v D i s c A m t > + 
+             < V A T A m t L i n e I n v D i s c B a s e A m t   E l e m e n t T y p e = " C o l u m n "   E l e m e n t I d = " 1 6 9 1 0 0 3 4 1 5 "   D a t a T y p e = " D e c i m a l " > V A T A m t L i n e I n v D i s c B a s e A m t < / V A T A m t L i n e I n v D i s c B a s e A m t > + 
+             < V A T A m t L i n e L i n e A m t   E l e m e n t T y p e = " C o l u m n "   E l e m e n t I d = " 1 8 8 2 1 0 3 2 6 2 "   D a t a T y p e = " D e c i m a l " > V A T A m t L i n e L i n e A m t < / V A T A m t L i n e L i n e A m t > + 
+             < V A T A m t L i n e V A T   E l e m e n t T y p e = " C o l u m n "   E l e m e n t I d = " 2 9 9 0 4 8 9 2 5 "   D a t a T y p e = " D e c i m a l " > V A T A m t L i n e V A T < / V A T A m t L i n e V A T > + 
+             < V A T A m t L i n e V A T A m t   E l e m e n t T y p e = " C o l u m n "   E l e m e n t I d = " 8 4 9 9 7 4 3 4 1 "   D a t a T y p e = " D e c i m a l " > V A T A m t L i n e V A T A m t < / V A T A m t L i n e V A T A m t > + 
+             < V A T A m t L i n e V A T B a s e   E l e m e n t T y p e = " C o l u m n "   E l e m e n t I d = " 1 4 1 9 8 1 6 2 1 8 "   D a t a T y p e = " D e c i m a l " > V A T A m t L i n e V A T B a s e < / V A T A m t L i n e V A T B a s e > + 
+             < V A T A m t L i n e V A T I d e n t i f i e r   E l e m e n t T y p e = " C o l u m n "   E l e m e n t I d = " 4 6 1 3 9 9 7 9 2 "   D a t a T y p e = " C o d e " > V A T A m t L i n e V A T I d e n t i f i e r < / V A T A m t L i n e V A T I d e n t i f i e r > + 
+         < / V A T C o u n t e r > + 
+         < V A T C o u n t e r L C Y   E l e m e n t T y p e = " D a t a I t e m "   E l e m e n t I d = " 9 1 0 2 7 8 4 9 2 " > + 
+             < V A L E x c h R a t e   E l e m e n t T y p e = " C o l u m n "   E l e m e n t I d = " 1 8 3 2 0 7 3 1 5 4 "   D a t a T y p e = " T e x t " > V A L E x c h R a t e < / V A L E x c h R a t e > + 
+             < V A L S p e c L C Y H e a d e r   E l e m e n t T y p e = " C o l u m n "   E l e m e n t I d = " 6 9 9 3 5 8 7 5 8 "   D a t a T y p e = " T e x t " > V A L S p e c L C Y H e a d e r < / V A L S p e c L C Y H e a d e r > + 
+             < V A L V A T A m o u n t L C Y   E l e m e n t T y p e = " C o l u m n "   E l e m e n t I d = " 1 4 4 5 9 7 3 0 8 7 "   D a t a T y p e = " D e c i m a l " > V A L V A T A m o u n t L C Y < / V A L V A T A m o u n t L C Y > + 
+             < V A L V A T B a s e L C Y   E l e m e n t T y p e = " C o l u m n "   E l e m e n t I d = " 1 4 3 9 0 5 7 6 6 6 "   D a t a T y p e = " D e c i m a l " > V A L V A T B a s e L C Y < / V A L V A T B a s e L C Y > + 
+         < / V A T C o u n t e r L C Y > + 
+         < P r e p m t L o o p   E l e m e n t T y p e = " D a t a I t e m "   E l e m e n t I d = " 1 1 5 9 7 3 9 4 0 7 " > + 
+             < P r e p a y m e n t S p e c C a p t i o n   E l e m e n t T y p e = " C o l u m n "   E l e m e n t I d = " 1 6 2 3 2 2 2 3 0 1 "   D a t a T y p e = " L a b e l " > P r e p a y m e n t S p e c C a p t i o n < / P r e p a y m e n t S p e c C a p t i o n > + 
+             < P r e p m t I n v B u D e s c C a p t i o n   E l e m e n t T y p e = " C o l u m n "   E l e m e n t I d = " 1 8 0 7 4 4 6 7 8 "   D a t a T y p e = " L a b e l " > P r e p m t I n v B u D e s c C a p t i o n < / P r e p m t I n v B u D e s c C a p t i o n > + 
+             < P r e p m t I n v B u f A m t   E l e m e n t T y p e = " C o l u m n "   E l e m e n t I d = " 1 0 9 6 9 7 6 1 9 5 "   D a t a T y p e = " D e c i m a l " > P r e p m t I n v B u f A m t < / P r e p m t I n v B u f A m t > + 
+             < P r e p m t I n v B u f D e s c   E l e m e n t T y p e = " C o l u m n "   E l e m e n t I d = " 2 2 5 6 0 3 3 1 8 "   D a t a T y p e = " T e x t " > P r e p m t I n v B u f D e s c < / P r e p m t I n v B u f D e s c > + 
+             < P r e p m t I n v B u f G L A c c N o   E l e m e n t T y p e = " C o l u m n "   E l e m e n t I d = " 8 7 1 9 7 7 4 0 0 "   D a t a T y p e = " C o d e " > P r e p m t I n v B u f G L A c c N o < / P r e p m t I n v B u f G L A c c N o > + 
+             < P r e p m t I n v B u f G L A c c N o C a p t i o n   E l e m e n t T y p e = " C o l u m n "   E l e m e n t I d = " 6 6 7 6 9 7 1 8 "   D a t a T y p e = " L a b e l " > P r e p m t I n v B u f G L A c c N o C a p t i o n < / P r e p m t I n v B u f G L A c c N o C a p t i o n > + 
+             < P r e p m t L i n e A m o u n t   E l e m e n t T y p e = " C o l u m n "   E l e m e n t I d = " 1 3 0 2 3 0 2 1 5 "   D a t a T y p e = " D e c i m a l " > P r e p m t L i n e A m o u n t < / P r e p m t L i n e A m o u n t > + 
+             < P r e p m t T o t a l A m o u n t I n c l V A T   E l e m e n t T y p e = " C o l u m n "   E l e m e n t I d = " 3 2 0 0 3 6 5 9 4 "   D a t a T y p e = " D e c i m a l " > P r e p m t T o t a l A m o u n t I n c l V A T < / P r e p m t T o t a l A m o u n t I n c l V A T > + 
+             < P r e p m t V A T A m o u n t   E l e m e n t T y p e = " C o l u m n "   E l e m e n t I d = " 2 1 0 3 3 9 3 6 6 0 "   D a t a T y p e = " D e c i m a l " > P r e p m t V A T A m o u n t < / P r e p m t V A T A m o u n t > + 
+             < P r e p m t V A T A m o u n t T e x t   E l e m e n t T y p e = " C o l u m n "   E l e m e n t I d = " 1 0 3 1 2 5 7 4 9 5 "   D a t a T y p e = " T e x t " > P r e p m t V A T A m o u n t T e x t < / P r e p m t V A T A m o u n t T e x t > + 
+             < P r e p m t V A T B a s e A m o u n t   E l e m e n t T y p e = " C o l u m n "   E l e m e n t I d = " 1 3 9 2 9 6 6 7 9 "   D a t a T y p e = " D e c i m a l " > P r e p m t V A T B a s e A m o u n t < / P r e p m t V A T B a s e A m o u n t > + 
+             < T o t a l E x c l V A T T e x t 2   E l e m e n t T y p e = " C o l u m n "   E l e m e n t I d = " 1 6 4 4 3 1 2 4 5 7 "   D a t a T y p e = " T e x t " > T o t a l E x c l V A T T e x t 2 < / T o t a l E x c l V A T T e x t 2 > + 
+             < T o t a l I n c l V A T T e x t 2   E l e m e n t T y p e = " C o l u m n "   E l e m e n t I d = " 2 0 8 6 8 8 9 6 8 3 "   D a t a T y p e = " T e x t " > T o t a l I n c l V A T T e x t 2 < / T o t a l I n c l V A T T e x t 2 > + 
+         < / P r e p m t L o o p > + 
+         < P r e p m t V A T C o u n t e r   E l e m e n t T y p e = " D a t a I t e m "   E l e m e n t I d = " 1 6 7 7 6 2 3 1 0 8 " > + 
+             < P r e p m t V A T A m t L i n e L i n e A m t   E l e m e n t T y p e = " C o l u m n "   E l e m e n t I d = " 4 0 2 6 8 5 8 2 4 "   D a t a T y p e = " D e c i m a l " > P r e p m t V A T A m t L i n e L i n e A m t < / P r e p m t V A T A m t L i n e L i n e A m t > + 
+             < P r e p m t V A T A m t L i n e V A T   E l e m e n t T y p e = " C o l u m n "   E l e m e n t I d = " 1 9 1 5 4 9 4 8 5 "   D a t a T y p e = " D e c i m a l " > P r e p m t V A T A m t L i n e V A T < / P r e p m t V A T A m t L i n e V A T > + 
+             < P r e p m t V A T A m t L i n e V A T A m t   E l e m e n t T y p e = " C o l u m n "   E l e m e n t I d = " 1 8 7 1 3 0 1 8 2 9 "   D a t a T y p e = " D e c i m a l " > P r e p m t V A T A m t L i n e V A T A m t < / P r e p m t V A T A m t L i n e V A T A m t > + 
+             < P r e p m t V A T A m t L i n e V A T B a s e   E l e m e n t T y p e = " C o l u m n "   E l e m e n t I d = " 1 2 2 6 9 0 4 6 9 6 "   D a t a T y p e = " D e c i m a l " > P r e p m t V A T A m t L i n e V A T B a s e < / P r e p m t V A T A m t L i n e V A T B a s e > + 
+             < P r e p m t V A T A m t L i n e V A T I d   E l e m e n t T y p e = " C o l u m n "   E l e m e n t I d = " 9 8 2 2 2 4 8 0 0 "   D a t a T y p e = " C o d e " > P r e p m t V A T A m t L i n e V A T I d < / P r e p m t V A T A m t L i n e V A T I d > + 
+             < P r e p y m t V A T A m t S p e c C a p t i o n   E l e m e n t T y p e = " C o l u m n "   E l e m e n t I d = " 2 0 0 9 6 4 9 1 3 8 "   D a t a T y p e = " L a b e l " > P r e p y m t V A T A m t S p e c C a p t i o n < / P r e p y m t V A T A m t S p e c C a p t i o n > + 
+         < / P r e p m t V A T C o u n t e r > + 
+         < L e t t e r T e x t   E l e m e n t T y p e = " D a t a I t e m "   E l e m e n t I d = " 1 5 1 0 3 5 3 8 3 4 " > + 
+             < w a n B e g i n n i n g C o n t e n t   E l e m e n t T y p e = " C o l u m n "   E l e m e n t I d = " 1 5 8 7 9 4 3 0 9 1 "   D a t a T y p e = " T e x t " > w a n B e g i n n i n g C o n t e n t < / w a n B e g i n n i n g C o n t e n t > + 
+             < w a n E n d i n g C o n t e n t   E l e m e n t T y p e = " C o l u m n "   E l e m e n t I d = " 9 4 3 7 6 0 7 5 7 "   D a t a T y p e = " T e x t " > w a n E n d i n g C o n t e n t < / w a n E n d i n g C o n t e n t > + 
+         < / L e t t e r T e x t > + 
+     < / P u r c h a s e _ H e a d e r > + 
+ < / N a v W o r d R e p o r t X m l P a r t > 
+</file>
+
 <file path=customXml/itemProps1.xml><?xml version="1.0" encoding="utf-8"?>
 <ds:datastoreItem xmlns:ds="http://schemas.openxmlformats.org/officeDocument/2006/customXml" ds:itemID="{7320341C-6788-4F0C-B9EA-269F5F4EA422}">
   <ds:schemaRefs>

</xml_diff>